<commit_message>
Significa: add form fields (headline <=125 chars, summary, cover letter)
- Moamen_Basyoni_Cover_Letter_Significa.md restructured as "application
  answers": Headline (111/125 chars), Summary (~830 chars, first person,
  AI-led), then the cover letter — each paste-ready
- profile.md §14b: new "Application-form fields" rule for char-limited
  headlines, separate summaries, and screening questions

Co-Authored-By: Claude Sonnet 5 <noreply@anthropic.com>
</commit_message>
<xml_diff>
--- a/job-application/Significa/Moamen_Basyoni_Cover_Letter_Significa.docx
+++ b/job-application/Significa/Moamen_Basyoni_Cover_Letter_Significa.docx
@@ -2,19 +2,25 @@
 <file path=word/document.xml><?xml version="1.0" encoding="utf-8"?>
 <w:document xmlns:w="http://schemas.openxmlformats.org/wordprocessingml/2006/main" xmlns:m="http://schemas.openxmlformats.org/officeDocument/2006/math" xmlns:r="http://schemas.openxmlformats.org/officeDocument/2006/relationships" xmlns:o="urn:schemas-microsoft-com:office:office" xmlns:v="urn:schemas-microsoft-com:vml" xmlns:w10="urn:schemas-microsoft-com:office:word" xmlns:a="http://schemas.openxmlformats.org/drawingml/2006/main" xmlns:pic="http://schemas.openxmlformats.org/drawingml/2006/picture" xmlns:wp="http://schemas.openxmlformats.org/drawingml/2006/wordprocessingDrawing">
   <w:body>
-    <w:bookmarkStart w:id="9" w:name="X00b34db3abac119c2afb9d0d3e15c5a984062fe"/>
+    <w:bookmarkStart w:id="12" w:name="X61c994cc004e1a17744fa5a2f4f2e3c5ffd7507"/>
     <w:p>
       <w:pPr>
         <w:pStyle w:val="Heading1"/>
       </w:pPr>
       <w:r>
-        <w:t xml:space="preserve">Cover Letter — Significa (Senior Backend Developer)</w:t>
+        <w:t xml:space="preserve">Significa (Senior Backend Developer) — application answers</w:t>
       </w:r>
     </w:p>
     <w:p>
       <w:pPr>
         <w:pStyle w:val="FirstParagraph"/>
       </w:pPr>
+      <w:r>
+        <w:t xml:space="preserve">The Significa form has three fields:</w:t>
+      </w:r>
+      <w:r>
+        <w:t xml:space="preserve"> </w:t>
+      </w:r>
       <w:r>
         <w:rPr>
           <w:b/>
@@ -26,25 +32,33 @@
         <w:t xml:space="preserve"> </w:t>
       </w:r>
       <w:r>
-        <w:t xml:space="preserve">—</w:t>
+        <w:t xml:space="preserve">(max 125 characters),</w:t>
       </w:r>
       <w:r>
         <w:t xml:space="preserve"> </w:t>
       </w:r>
       <w:r>
         <w:rPr>
-          <w:i/>
-          <w:iCs/>
+          <w:b/>
+          <w:bCs/>
         </w:rPr>
-        <w:t xml:space="preserve">LinkedIn note to the hiring team / email opener:</w:t>
-      </w:r>
-    </w:p>
-    <w:p>
-      <w:pPr>
-        <w:pStyle w:val="BlockText"/>
-      </w:pPr>
-      <w:r>
-        <w:t xml:space="preserve">Backend developer who is production-fluent in the exact AI stack you list as preferred — LLM APIs (OpenAI, Anthropic), agent frameworks (LangGraph, CrewAI), Model Context Protocol, Claude Code daily — on a solid C# / ASP.NET Core base with real third-party-integration and identity work.</w:t>
+        <w:t xml:space="preserve">Summary</w:t>
+      </w:r>
+      <w:r>
+        <w:t xml:space="preserve">, and</w:t>
+      </w:r>
+      <w:r>
+        <w:t xml:space="preserve"> </w:t>
+      </w:r>
+      <w:r>
+        <w:rPr>
+          <w:b/>
+          <w:bCs/>
+        </w:rPr>
+        <w:t xml:space="preserve">Cover Letter</w:t>
+      </w:r>
+      <w:r>
+        <w:t xml:space="preserve">. Paste each one separately.</w:t>
       </w:r>
     </w:p>
     <w:p>
@@ -52,6 +66,65 @@
         <w:pict>
           <v:rect style="width:0;height:1.5pt" o:hralign="center" o:hrstd="t" o:hr="t"/>
         </w:pict>
+      </w:r>
+    </w:p>
+    <w:bookmarkStart w:id="9" w:name="headline-111-125-characters"/>
+    <w:p>
+      <w:pPr>
+        <w:pStyle w:val="Heading2"/>
+      </w:pPr>
+      <w:r>
+        <w:t xml:space="preserve">Headline — 111 / 125 characters</w:t>
+      </w:r>
+    </w:p>
+    <w:p>
+      <w:pPr>
+        <w:pStyle w:val="FirstParagraph"/>
+      </w:pPr>
+      <w:r>
+        <w:t xml:space="preserve">Senior .NET backend developer — production AI (LLM APIs, agents, MCP, RAG) + C#/ASP.NET Core, Claude Code daily</w:t>
+      </w:r>
+    </w:p>
+    <w:p>
+      <w:r>
+        <w:pict>
+          <v:rect style="width:0;height:1.5pt" o:hralign="center" o:hrstd="t" o:hr="t"/>
+        </w:pict>
+      </w:r>
+    </w:p>
+    <w:bookmarkEnd w:id="9"/>
+    <w:bookmarkStart w:id="10" w:name="summary"/>
+    <w:p>
+      <w:pPr>
+        <w:pStyle w:val="Heading2"/>
+      </w:pPr>
+      <w:r>
+        <w:t xml:space="preserve">Summary</w:t>
+      </w:r>
+    </w:p>
+    <w:p>
+      <w:pPr>
+        <w:pStyle w:val="FirstParagraph"/>
+      </w:pPr>
+      <w:r>
+        <w:t xml:space="preserve">Backend developer with around three years building and maintaining .NET systems on C# and ASP.NET Core, with a focus on AI-integrated backends. I’ve shipped LLM API integration and multi-model orchestration (OpenAI, OpenRouter), retrieval-augmented generation and GraphRAG systems on Neo4j, agent workflows with LangGraph and CrewAI, and internal Model Context Protocol (MCP) servers — with observability, guardrails, and cost controls in production. On the fundamentals: REST API design, SOLID, OWASP-aware secure coding, an OpenID Connect / OAuth2 identity server, third-party integrations (Microsoft Graph, SharePoint, Stripe and Paymob payments), and CI/CD with Docker and Azure. I use Claude and Claude Code daily, and I’m comfortable owning features end to end and contributing to architecture decisions.</w:t>
+      </w:r>
+    </w:p>
+    <w:p>
+      <w:r>
+        <w:pict>
+          <v:rect style="width:0;height:1.5pt" o:hralign="center" o:hrstd="t" o:hr="t"/>
+        </w:pict>
+      </w:r>
+    </w:p>
+    <w:bookmarkEnd w:id="10"/>
+    <w:bookmarkStart w:id="11" w:name="cover-letter"/>
+    <w:p>
+      <w:pPr>
+        <w:pStyle w:val="Heading2"/>
+      </w:pPr>
+      <w:r>
+        <w:t xml:space="preserve">Cover Letter</w:t>
       </w:r>
     </w:p>
     <w:p>
@@ -202,7 +275,8 @@
         <w:t xml:space="preserve">Moamen Basyoni</w:t>
       </w:r>
     </w:p>
-    <w:bookmarkEnd w:id="9"/>
+    <w:bookmarkEnd w:id="11"/>
+    <w:bookmarkEnd w:id="12"/>
     <w:sectPr>
       <w:footnotePr>
         <w:numRestart w:val="eachSect"/>

</xml_diff>